<commit_message>
Checkpoint added from and to role dates
</commit_message>
<xml_diff>
--- a/docs/My Book.docx
+++ b/docs/My Book.docx
@@ -444,14 +444,44 @@
           <w:numId w:val="1"/>
         </w:numPr>
         <w:rPr>
-          <w:lang w:val="en-US"/>
-        </w:rPr>
-      </w:pPr>
-      <w:r>
-        <w:rPr>
+          <w:strike/>
+          <w:lang w:val="en-US"/>
+        </w:rPr>
+      </w:pPr>
+      <w:r>
+        <w:rPr>
+          <w:strike/>
           <w:lang w:val="en-US"/>
         </w:rPr>
         <w:t>Sobbing. Her dad had not long died. She never finished.</w:t>
+      </w:r>
+      <w:r>
+        <w:rPr>
+          <w:strike/>
+          <w:lang w:val="en-US"/>
+        </w:rPr>
+        <w:t xml:space="preserve"> </w:t>
+      </w:r>
+      <w:r>
+        <w:rPr>
+          <w:strike/>
+          <w:lang w:val="en-US"/>
+        </w:rPr>
+        <w:t>The f</w:t>
+      </w:r>
+      <w:r>
+        <w:rPr>
+          <w:strike/>
+          <w:lang w:val="en-US"/>
+        </w:rPr>
+        <w:t>riends</w:t>
+      </w:r>
+      <w:r>
+        <w:rPr>
+          <w:strike/>
+          <w:lang w:val="en-US"/>
+        </w:rPr>
+        <w:t>.</w:t>
       </w:r>
     </w:p>
     <w:p>
@@ -639,6 +669,13 @@
           <w:lang w:val="en-US"/>
         </w:rPr>
         <w:br/>
+        <w:t>- The TA gave me space and solitude.</w:t>
+      </w:r>
+      <w:r>
+        <w:rPr>
+          <w:lang w:val="en-US"/>
+        </w:rPr>
+        <w:br/>
       </w:r>
     </w:p>
     <w:p>
@@ -1887,7 +1924,7 @@
           <w:lang w:val="en-US"/>
         </w:rPr>
         <w:lastRenderedPageBreak/>
-        <w:t>Tears on the trail</w:t>
+        <w:t>The friends</w:t>
       </w:r>
     </w:p>
     <w:p>
@@ -1989,10 +2026,33 @@
     </w:p>
     <w:p>
       <w:r>
-        <w:t xml:space="preserve">We were directed to a spot at the back for TA walkers. I pitched my tent and then scouted out the ground. It was tidy, clean and had all the facilities I needed. </w:t>
-      </w:r>
-      <w:r>
-        <w:t xml:space="preserve">It was early afternoon, too early for a meal and too late to have skipped the camp and journeyed on. </w:t>
+        <w:t>We were directed to a spot at the back</w:t>
+      </w:r>
+      <w:r>
+        <w:t xml:space="preserve"> of the campground </w:t>
+      </w:r>
+      <w:r>
+        <w:t xml:space="preserve">for TA walkers. I pitched my tent and then scouted out the ground. It was tidy, clean and had all the facilities I needed. </w:t>
+      </w:r>
+      <w:r>
+        <w:t>It was early afternoon</w:t>
+      </w:r>
+      <w:r>
+        <w:t xml:space="preserve"> and</w:t>
+      </w:r>
+      <w:r>
+        <w:t xml:space="preserve"> too early for a </w:t>
+      </w:r>
+      <w:proofErr w:type="gramStart"/>
+      <w:r>
+        <w:t>meal</w:t>
+      </w:r>
+      <w:proofErr w:type="gramEnd"/>
+      <w:r>
+        <w:t xml:space="preserve"> so</w:t>
+      </w:r>
+      <w:r>
+        <w:t xml:space="preserve"> </w:t>
       </w:r>
       <w:r>
         <w:t>I crawled into my tent</w:t>
@@ -2076,67 +2136,330 @@
         <w:rPr>
           <w:lang w:val="en-US"/>
         </w:rPr>
-        <w:t xml:space="preserve">She </w:t>
+        <w:t>She had just finished university studying nutrition</w:t>
+      </w:r>
+      <w:r>
+        <w:rPr>
+          <w:lang w:val="en-US"/>
+        </w:rPr>
+        <w:t xml:space="preserve"> and was taking a break before starting out on her career</w:t>
+      </w:r>
+      <w:r>
+        <w:rPr>
+          <w:lang w:val="en-US"/>
+        </w:rPr>
+        <w:t xml:space="preserve">. I didn’t mention my failed Uncle Ben Rice experiment. </w:t>
+      </w:r>
+    </w:p>
+    <w:p>
+      <w:r>
+        <w:rPr>
+          <w:lang w:val="en-US"/>
+        </w:rPr>
+        <w:t xml:space="preserve">Later </w:t>
       </w:r>
       <w:proofErr w:type="gramStart"/>
       <w:r>
         <w:rPr>
           <w:lang w:val="en-US"/>
         </w:rPr>
-        <w:t>had</w:t>
+        <w:t>on</w:t>
       </w:r>
       <w:proofErr w:type="gramEnd"/>
       <w:r>
         <w:rPr>
           <w:lang w:val="en-US"/>
         </w:rPr>
-        <w:t xml:space="preserve"> just finished university studying nutrition. I didn’t mention my failed Uncle Ben Rice experiment. </w:t>
-      </w:r>
-    </w:p>
-    <w:p>
-      <w:r>
-        <w:rPr>
-          <w:lang w:val="en-US"/>
-        </w:rPr>
-        <w:t xml:space="preserve">Later </w:t>
+        <w:t xml:space="preserve"> t</w:t>
+      </w:r>
+      <w:r>
+        <w:rPr>
+          <w:lang w:val="en-US"/>
+        </w:rPr>
+        <w:t xml:space="preserve">he other </w:t>
+      </w:r>
+      <w:r>
+        <w:rPr>
+          <w:lang w:val="en-US"/>
+        </w:rPr>
+        <w:t>girl</w:t>
+      </w:r>
+      <w:r>
+        <w:rPr>
+          <w:lang w:val="en-US"/>
+        </w:rPr>
+        <w:t xml:space="preserve"> </w:t>
+      </w:r>
+      <w:r>
+        <w:rPr>
+          <w:lang w:val="en-US"/>
+        </w:rPr>
+        <w:t>came over and she seemed</w:t>
+      </w:r>
+      <w:r>
+        <w:rPr>
+          <w:lang w:val="en-US"/>
+        </w:rPr>
+        <w:t xml:space="preserve"> </w:t>
+      </w:r>
+      <w:r>
+        <w:rPr>
+          <w:lang w:val="en-US"/>
+        </w:rPr>
+        <w:t xml:space="preserve">very </w:t>
+      </w:r>
+      <w:r>
+        <w:rPr>
+          <w:lang w:val="en-US"/>
+        </w:rPr>
+        <w:t>reserved</w:t>
+      </w:r>
+      <w:r>
+        <w:rPr>
+          <w:lang w:val="en-US"/>
+        </w:rPr>
+        <w:t>.</w:t>
+      </w:r>
+      <w:r>
+        <w:rPr>
+          <w:lang w:val="en-US"/>
+        </w:rPr>
+        <w:t xml:space="preserve"> </w:t>
+      </w:r>
+      <w:r>
+        <w:rPr>
+          <w:lang w:val="en-US"/>
+        </w:rPr>
+        <w:t>She ha</w:t>
+      </w:r>
+      <w:r>
+        <w:rPr>
+          <w:lang w:val="en-US"/>
+        </w:rPr>
+        <w:t>d</w:t>
+      </w:r>
+      <w:r>
+        <w:rPr>
+          <w:lang w:val="en-US"/>
+        </w:rPr>
+        <w:t xml:space="preserve"> finished studying agriculture and had been working on the family farm. It was her friend who was the inspiration for the walk, and s</w:t>
+      </w:r>
+      <w:r>
+        <w:rPr>
+          <w:lang w:val="en-US"/>
+        </w:rPr>
+        <w:t xml:space="preserve">he had </w:t>
+      </w:r>
+      <w:r>
+        <w:rPr>
+          <w:lang w:val="en-US"/>
+        </w:rPr>
+        <w:t xml:space="preserve">only agreed to </w:t>
+      </w:r>
+      <w:r>
+        <w:rPr>
+          <w:lang w:val="en-US"/>
+        </w:rPr>
+        <w:t xml:space="preserve">join her </w:t>
+      </w:r>
+      <w:r>
+        <w:rPr>
+          <w:lang w:val="en-US"/>
+        </w:rPr>
+        <w:t xml:space="preserve">just before they set off. She told </w:t>
+      </w:r>
+      <w:r>
+        <w:rPr>
+          <w:lang w:val="en-US"/>
+        </w:rPr>
+        <w:t>me her</w:t>
+      </w:r>
+      <w:r>
+        <w:rPr>
+          <w:lang w:val="en-US"/>
+        </w:rPr>
+        <w:t xml:space="preserve"> dad had recently passed away</w:t>
+      </w:r>
+      <w:r>
+        <w:rPr>
+          <w:lang w:val="en-US"/>
+        </w:rPr>
+        <w:t>. I offered condolences and we moved on to talk about the walk, but her sadness was evident.</w:t>
+      </w:r>
+      <w:r>
+        <w:rPr>
+          <w:lang w:val="en-US"/>
+        </w:rPr>
+        <w:t xml:space="preserve"> </w:t>
+      </w:r>
+    </w:p>
+    <w:p>
+      <w:pPr>
+        <w:rPr>
+          <w:lang w:val="en-US"/>
+        </w:rPr>
+      </w:pPr>
+      <w:r>
+        <w:rPr>
+          <w:lang w:val="en-US"/>
+        </w:rPr>
+        <w:t xml:space="preserve">Next morning I left early. I called in at the local bakery and bought a mussel pie from the local bakery, oh my god it was good! The road out of Havelock runs beside </w:t>
+      </w:r>
+      <w:r>
+        <w:t xml:space="preserve">Pelorus </w:t>
+      </w:r>
+      <w:r>
+        <w:t xml:space="preserve">sound. The sun was just coming up and the </w:t>
+      </w:r>
+      <w:r>
+        <w:t xml:space="preserve">day was clear, the water </w:t>
+      </w:r>
+      <w:r>
+        <w:t xml:space="preserve">looked stunning in the morning sun. </w:t>
+      </w:r>
+      <w:r>
+        <w:t xml:space="preserve">After an easy few kms along the road and though a farm, </w:t>
+      </w:r>
+      <w:r>
+        <w:rPr>
+          <w:lang w:val="en-US"/>
+        </w:rPr>
+        <w:t xml:space="preserve">I started the Richmond Ranges section. </w:t>
+      </w:r>
+      <w:r>
+        <w:rPr>
+          <w:lang w:val="en-US"/>
+        </w:rPr>
+        <w:t>It’s a</w:t>
+      </w:r>
+      <w:r>
+        <w:rPr>
+          <w:lang w:val="en-US"/>
+        </w:rPr>
+        <w:t xml:space="preserve"> </w:t>
+      </w:r>
+      <w:r>
+        <w:rPr>
+          <w:lang w:val="en-US"/>
+        </w:rPr>
+        <w:t>beautiful</w:t>
+      </w:r>
+      <w:r>
+        <w:rPr>
+          <w:lang w:val="en-US"/>
+        </w:rPr>
+        <w:t xml:space="preserve"> and </w:t>
+      </w:r>
+      <w:r>
+        <w:rPr>
+          <w:lang w:val="en-US"/>
+        </w:rPr>
+        <w:t>rugged mountain range that took me 8 days to transverse.</w:t>
+      </w:r>
+    </w:p>
+    <w:p>
+      <w:r>
+        <w:t>Midway through the range it started to snow</w:t>
+      </w:r>
+      <w:r>
+        <w:t xml:space="preserve"> with strong winds</w:t>
+      </w:r>
+      <w:r>
+        <w:t xml:space="preserve">. </w:t>
+      </w:r>
+      <w:r>
+        <w:t xml:space="preserve">I got to Old Man’s hut early afternoon and decided to hold up there. I played it safe as the next stage involved crossing Mount Rintoul and I had read a few accounts of people warning of the narrow track. I lit the fire and was enjoying a cuppa when a group of seniors turned up. They </w:t>
+      </w:r>
+      <w:r>
+        <w:lastRenderedPageBreak/>
+        <w:t xml:space="preserve">were a great bunch of guys, ex university students who had studied engineering together back in the 70s. They meet up annually to do walks and were well organised. Their food was fresh and </w:t>
       </w:r>
       <w:proofErr w:type="gramStart"/>
       <w:r>
-        <w:rPr>
-          <w:lang w:val="en-US"/>
-        </w:rPr>
-        <w:t>on</w:t>
+        <w:t>plentiful</w:t>
       </w:r>
       <w:proofErr w:type="gramEnd"/>
       <w:r>
-        <w:rPr>
-          <w:lang w:val="en-US"/>
-        </w:rPr>
-        <w:t xml:space="preserve"> t</w:t>
-      </w:r>
-      <w:r>
-        <w:rPr>
-          <w:lang w:val="en-US"/>
-        </w:rPr>
-        <w:t xml:space="preserve">he other </w:t>
-      </w:r>
-      <w:r>
-        <w:rPr>
-          <w:lang w:val="en-US"/>
-        </w:rPr>
-        <w:t>girl</w:t>
-      </w:r>
-      <w:r>
-        <w:rPr>
-          <w:lang w:val="en-US"/>
-        </w:rPr>
+        <w:t xml:space="preserve"> and they offered me a meal</w:t>
+      </w:r>
+      <w:r>
+        <w:t>.</w:t>
+      </w:r>
+      <w:r>
         <w:t xml:space="preserve"> </w:t>
       </w:r>
       <w:r>
-        <w:rPr>
-          <w:lang w:val="en-US"/>
-        </w:rPr>
-        <w:t>came over and she seemed</w:t>
+        <w:t>I never turned down food on the TA.</w:t>
+      </w:r>
+    </w:p>
+    <w:p>
+      <w:r>
+        <w:t>The next day was no different. Lots of wind and snow so I decided to stay put. The seniors did the same and we sat around the hut chewing the fat, drinking teas and coffees, eating the odd biscuit and having a few laughs. The following day was clear and sunny. I set off over the mount in the snow and reached the next hut ok.</w:t>
+      </w:r>
+    </w:p>
+    <w:p>
+      <w:pPr>
+        <w:rPr>
+          <w:lang w:val="en-US"/>
+        </w:rPr>
+      </w:pPr>
+      <w:r>
+        <w:rPr>
+          <w:lang w:val="en-US"/>
+        </w:rPr>
+        <w:t xml:space="preserve">I ran into the girls a couple of </w:t>
+      </w:r>
+      <w:proofErr w:type="gramStart"/>
+      <w:r>
+        <w:rPr>
+          <w:lang w:val="en-US"/>
+        </w:rPr>
+        <w:t>times</w:t>
+      </w:r>
+      <w:proofErr w:type="gramEnd"/>
+      <w:r>
+        <w:rPr>
+          <w:lang w:val="en-US"/>
+        </w:rPr>
+        <w:t xml:space="preserve"> and </w:t>
+      </w:r>
+      <w:r>
+        <w:rPr>
+          <w:lang w:val="en-US"/>
+        </w:rPr>
+        <w:t xml:space="preserve">we </w:t>
+      </w:r>
+      <w:r>
+        <w:rPr>
+          <w:lang w:val="en-US"/>
+        </w:rPr>
+        <w:t xml:space="preserve">overnighted together in the </w:t>
+      </w:r>
+      <w:r>
+        <w:rPr>
+          <w:lang w:val="en-US"/>
+        </w:rPr>
+        <w:t xml:space="preserve">same hut </w:t>
+      </w:r>
+      <w:r>
+        <w:rPr>
+          <w:lang w:val="en-US"/>
+        </w:rPr>
+        <w:t xml:space="preserve">[name]. The Isabella look alike was always friendly, talkative and fun, the other subdued. </w:t>
+      </w:r>
+    </w:p>
+    <w:p>
+      <w:r>
+        <w:rPr>
+          <w:lang w:val="en-US"/>
+        </w:rPr>
+        <w:t xml:space="preserve">I exited the Richmond’s </w:t>
+      </w:r>
+      <w:r>
+        <w:rPr>
+          <w:lang w:val="en-US"/>
+        </w:rPr>
+        <w:t>and had a short walk to</w:t>
       </w:r>
       <w:r>
         <w:rPr>
@@ -2145,22 +2468,23 @@
         <w:t xml:space="preserve"> </w:t>
       </w:r>
       <w:r>
-        <w:rPr>
-          <w:lang w:val="en-US"/>
-        </w:rPr>
-        <w:t xml:space="preserve">very </w:t>
-      </w:r>
-      <w:r>
-        <w:rPr>
-          <w:lang w:val="en-US"/>
-        </w:rPr>
-        <w:t>reserved</w:t>
-      </w:r>
-      <w:r>
-        <w:rPr>
-          <w:lang w:val="en-US"/>
-        </w:rPr>
-        <w:t>.</w:t>
+        <w:t>St Arnaud</w:t>
+      </w:r>
+      <w:r>
+        <w:t>. Here I picked up my food supplies that I had previously sent down from Wellington. The TA has several forward drop points, strategically located so that food and supplies can be picked up on route.</w:t>
+      </w:r>
+    </w:p>
+    <w:p>
+      <w:pPr>
+        <w:rPr>
+          <w:lang w:val="en-US"/>
+        </w:rPr>
+      </w:pPr>
+      <w:r>
+        <w:rPr>
+          <w:lang w:val="en-US"/>
+        </w:rPr>
+        <w:t>My arrival at</w:t>
       </w:r>
       <w:r>
         <w:rPr>
@@ -2169,66 +2493,354 @@
         <w:t xml:space="preserve"> </w:t>
       </w:r>
       <w:r>
-        <w:rPr>
-          <w:lang w:val="en-US"/>
-        </w:rPr>
-        <w:t xml:space="preserve">She has finished studying agriculture and </w:t>
+        <w:t>St Arnaud</w:t>
+      </w:r>
+      <w:r>
+        <w:t xml:space="preserve"> </w:t>
+      </w:r>
+      <w:r>
+        <w:t xml:space="preserve">coincided with holes my </w:t>
+      </w:r>
+      <w:r>
+        <w:t xml:space="preserve">Merrell </w:t>
+      </w:r>
+      <w:r>
+        <w:t xml:space="preserve">boots. </w:t>
+      </w:r>
+      <w:r>
+        <w:t>I really liked them and t</w:t>
+      </w:r>
+      <w:r>
+        <w:t>hey had done well, a good [number] kms</w:t>
+      </w:r>
+      <w:r>
+        <w:t xml:space="preserve"> of sand, water</w:t>
+      </w:r>
+      <w:r>
+        <w:t>, rocks</w:t>
+      </w:r>
+      <w:r>
+        <w:t xml:space="preserve"> and hills</w:t>
+      </w:r>
+      <w:r>
+        <w:t xml:space="preserve">. </w:t>
+      </w:r>
+      <w:r>
+        <w:t>However t</w:t>
+      </w:r>
+      <w:r>
+        <w:t xml:space="preserve">heir </w:t>
+      </w:r>
+      <w:r>
+        <w:t>life</w:t>
+      </w:r>
+      <w:r>
+        <w:t xml:space="preserve"> was at an end, and the next section was another rugged mountain range. </w:t>
+      </w:r>
+      <w:r>
+        <w:t xml:space="preserve">I thought of duck tapping them but eventually decided to </w:t>
+      </w:r>
+      <w:r>
+        <w:t xml:space="preserve">cut out of the walk and hitch hike to </w:t>
+      </w:r>
+      <w:r>
+        <w:rPr>
+          <w:lang w:val="en-US"/>
+        </w:rPr>
+        <w:t>Blenheim</w:t>
+      </w:r>
+      <w:r>
+        <w:t xml:space="preserve">. </w:t>
+      </w:r>
+      <w:r>
+        <w:t>It took all afternoon to travel 100 kms and I arrived at 4:45</w:t>
+      </w:r>
+      <w:r>
+        <w:t>,</w:t>
+      </w:r>
+      <w:r>
+        <w:t xml:space="preserve"> </w:t>
+      </w:r>
+      <w:r>
+        <w:t>j</w:t>
+      </w:r>
+      <w:r>
+        <w:t>ust in time to find a shop that stocked hiking boots. Unfortunately</w:t>
+      </w:r>
+      <w:r>
+        <w:t>,</w:t>
+      </w:r>
+      <w:r>
+        <w:t xml:space="preserve"> they didn’t have </w:t>
+      </w:r>
+      <w:r>
+        <w:t>Merr</w:t>
+      </w:r>
+      <w:r>
+        <w:t>e</w:t>
+      </w:r>
+      <w:r>
+        <w:t>lls</w:t>
+      </w:r>
+      <w:r>
+        <w:t xml:space="preserve">. </w:t>
+      </w:r>
+      <w:r>
+        <w:t xml:space="preserve">I bought a pair of </w:t>
+      </w:r>
+      <w:r>
+        <w:t>Oboz</w:t>
+      </w:r>
+      <w:r>
+        <w:t xml:space="preserve"> and called Cynthia to see if I could stay the night. Cynthia was another old university friend and wife of John who I had walked the </w:t>
+      </w:r>
+      <w:r>
+        <w:rPr>
+          <w:lang w:val="en-US"/>
+        </w:rPr>
+        <w:t>Queen Charlotte with.</w:t>
+      </w:r>
+      <w:r>
+        <w:rPr>
+          <w:lang w:val="en-US"/>
+        </w:rPr>
+        <w:t xml:space="preserve"> </w:t>
+      </w:r>
+    </w:p>
+    <w:p>
+      <w:r>
+        <w:rPr>
+          <w:lang w:val="en-US"/>
+        </w:rPr>
+        <w:t xml:space="preserve">As a student I flatted with </w:t>
+      </w:r>
+      <w:r>
+        <w:t xml:space="preserve">Cynthia for 2 years in Palmerston North along with Tim and Shelley. We were a tight group of friends who </w:t>
+      </w:r>
+      <w:r>
+        <w:t xml:space="preserve">went </w:t>
+      </w:r>
+      <w:r>
+        <w:t xml:space="preserve">our own ways after university. </w:t>
+      </w:r>
+      <w:r>
+        <w:t>I had caught up with Cynthia infrequently through the years, so i</w:t>
+      </w:r>
+      <w:r>
+        <w:t xml:space="preserve">t was great to catch up with </w:t>
+      </w:r>
+      <w:r>
+        <w:t>them</w:t>
+      </w:r>
+      <w:r>
+        <w:t xml:space="preserve"> </w:t>
+      </w:r>
+      <w:r>
+        <w:t xml:space="preserve">again </w:t>
+      </w:r>
+      <w:r>
+        <w:t xml:space="preserve">and chew the fat. </w:t>
+      </w:r>
+    </w:p>
+    <w:p>
+      <w:r>
+        <w:t xml:space="preserve">The next morning John said he would drop me off on the outskirts of Blenheim so that I could hitch back to </w:t>
+      </w:r>
+      <w:r>
+        <w:t>St Arnaud</w:t>
+      </w:r>
+      <w:r>
+        <w:t>. To my surprise and g</w:t>
+      </w:r>
+      <w:r>
+        <w:t xml:space="preserve">ratitude, </w:t>
+      </w:r>
+      <w:r>
+        <w:t xml:space="preserve">he took me all the way, dropping me at the point I had cut out. I walked to the trail head on the shores of lake </w:t>
+      </w:r>
+      <w:r>
+        <w:t>Rotoiti</w:t>
+      </w:r>
+      <w:r>
+        <w:t xml:space="preserve"> and stood admiring the </w:t>
+      </w:r>
+      <w:r>
+        <w:t xml:space="preserve">fantastic </w:t>
+      </w:r>
+      <w:r>
+        <w:t>view.</w:t>
+      </w:r>
+      <w:r>
+        <w:t xml:space="preserve"> It is a </w:t>
+      </w:r>
+      <w:r>
+        <w:t>glacial lake</w:t>
+      </w:r>
+      <w:r>
+        <w:t xml:space="preserve"> beautifully bordered by mountains.</w:t>
+      </w:r>
+    </w:p>
+    <w:p>
+      <w:r>
+        <w:t xml:space="preserve">To my surprise the two girls </w:t>
+      </w:r>
+      <w:r>
+        <w:t xml:space="preserve">pulled up </w:t>
+      </w:r>
+      <w:r>
+        <w:t xml:space="preserve">in a van. </w:t>
+      </w:r>
+      <w:r>
+        <w:rPr>
+          <w:lang w:val="en-US"/>
+        </w:rPr>
+        <w:t>Isabella’s look</w:t>
+      </w:r>
+      <w:r>
+        <w:rPr>
+          <w:lang w:val="en-US"/>
+        </w:rPr>
+        <w:t>-</w:t>
+      </w:r>
+      <w:r>
+        <w:rPr>
+          <w:lang w:val="en-US"/>
+        </w:rPr>
+        <w:t>a</w:t>
+      </w:r>
+      <w:r>
+        <w:rPr>
+          <w:lang w:val="en-US"/>
+        </w:rPr>
+        <w:t>-</w:t>
       </w:r>
       <w:proofErr w:type="gramStart"/>
       <w:r>
         <w:rPr>
           <w:lang w:val="en-US"/>
         </w:rPr>
-        <w:t>had</w:t>
+        <w:t>like’s</w:t>
       </w:r>
       <w:proofErr w:type="gramEnd"/>
       <w:r>
         <w:rPr>
           <w:lang w:val="en-US"/>
         </w:rPr>
-        <w:t xml:space="preserve"> been working on the family farm. It was her friend who was the inspiration for the walk, and s</w:t>
-      </w:r>
-      <w:r>
-        <w:rPr>
-          <w:lang w:val="en-US"/>
-        </w:rPr>
-        <w:t xml:space="preserve">he had </w:t>
-      </w:r>
-      <w:r>
-        <w:rPr>
-          <w:lang w:val="en-US"/>
-        </w:rPr>
-        <w:t xml:space="preserve">only agreed to </w:t>
-      </w:r>
-      <w:r>
-        <w:rPr>
-          <w:lang w:val="en-US"/>
-        </w:rPr>
-        <w:t xml:space="preserve">join her </w:t>
-      </w:r>
-      <w:r>
-        <w:rPr>
-          <w:lang w:val="en-US"/>
-        </w:rPr>
-        <w:t xml:space="preserve">just before they set off. She told </w:t>
-      </w:r>
-      <w:r>
-        <w:rPr>
-          <w:lang w:val="en-US"/>
-        </w:rPr>
-        <w:t>me her</w:t>
-      </w:r>
-      <w:r>
-        <w:rPr>
-          <w:lang w:val="en-US"/>
-        </w:rPr>
-        <w:t xml:space="preserve"> dad had recently passed away</w:t>
-      </w:r>
-      <w:r>
-        <w:rPr>
-          <w:lang w:val="en-US"/>
-        </w:rPr>
-        <w:t>. I offered condolences and we moved on to talk about the walk, but her sadness was evident.</w:t>
+        <w:t xml:space="preserve"> mum had driven them and was joining them for a short way into the track. We h</w:t>
+      </w:r>
+      <w:r>
+        <w:rPr>
+          <w:lang w:val="en-US"/>
+        </w:rPr>
+        <w:t>ad</w:t>
+      </w:r>
+      <w:r>
+        <w:rPr>
+          <w:lang w:val="en-US"/>
+        </w:rPr>
+        <w:t xml:space="preserve"> a quick </w:t>
+      </w:r>
+      <w:proofErr w:type="gramStart"/>
+      <w:r>
+        <w:rPr>
+          <w:lang w:val="en-US"/>
+        </w:rPr>
+        <w:t>chat</w:t>
+      </w:r>
+      <w:proofErr w:type="gramEnd"/>
+      <w:r>
+        <w:rPr>
+          <w:lang w:val="en-US"/>
+        </w:rPr>
+        <w:t xml:space="preserve"> and they set off ahead of me. </w:t>
+      </w:r>
+    </w:p>
+    <w:p>
+      <w:pPr>
+        <w:rPr>
+          <w:lang w:val="en-US"/>
+        </w:rPr>
+      </w:pPr>
+      <w:r>
+        <w:rPr>
+          <w:lang w:val="en-US"/>
+        </w:rPr>
+        <w:t xml:space="preserve">I had not long walked along side Rotoiti when I came across the girls. </w:t>
+      </w:r>
+      <w:r>
+        <w:rPr>
+          <w:lang w:val="en-US"/>
+        </w:rPr>
+        <w:t>I could sense the energy before I saw t</w:t>
+      </w:r>
+      <w:r>
+        <w:rPr>
+          <w:lang w:val="en-US"/>
+        </w:rPr>
+        <w:t xml:space="preserve">he friend sobbing uncontrollably. </w:t>
+      </w:r>
+      <w:r>
+        <w:rPr>
+          <w:lang w:val="en-US"/>
+        </w:rPr>
+        <w:t xml:space="preserve">She was sitting on the ground and </w:t>
+      </w:r>
+      <w:r>
+        <w:rPr>
+          <w:lang w:val="en-US"/>
+        </w:rPr>
+        <w:t>Isabella’s look-a-</w:t>
+      </w:r>
+      <w:proofErr w:type="gramStart"/>
+      <w:r>
+        <w:rPr>
+          <w:lang w:val="en-US"/>
+        </w:rPr>
+        <w:t>like’s</w:t>
+      </w:r>
+      <w:proofErr w:type="gramEnd"/>
+      <w:r>
+        <w:rPr>
+          <w:lang w:val="en-US"/>
+        </w:rPr>
+        <w:t xml:space="preserve"> mum</w:t>
+      </w:r>
+      <w:r>
+        <w:rPr>
+          <w:lang w:val="en-US"/>
+        </w:rPr>
+        <w:t xml:space="preserve"> was hugging her with </w:t>
+      </w:r>
+      <w:r>
+        <w:rPr>
+          <w:lang w:val="en-US"/>
+        </w:rPr>
+        <w:t>Isabella</w:t>
+      </w:r>
+      <w:r>
+        <w:rPr>
+          <w:lang w:val="en-US"/>
+        </w:rPr>
+        <w:t xml:space="preserve"> standing beside her. </w:t>
+      </w:r>
+      <w:r>
+        <w:rPr>
+          <w:lang w:val="en-US"/>
+        </w:rPr>
+        <w:t xml:space="preserve">I didn’t feel awkward or sad, just relief that she was letting her grief go. There was nothing for </w:t>
+      </w:r>
+      <w:r>
+        <w:rPr>
+          <w:lang w:val="en-US"/>
+        </w:rPr>
+        <w:lastRenderedPageBreak/>
+        <w:t>me to say</w:t>
+      </w:r>
+      <w:r>
+        <w:rPr>
+          <w:lang w:val="en-US"/>
+        </w:rPr>
+        <w:t xml:space="preserve"> and I just carried on. I</w:t>
       </w:r>
       <w:r>
         <w:rPr>
@@ -2236,45 +2848,47 @@
         </w:rPr>
         <w:t xml:space="preserve"> </w:t>
       </w:r>
-    </w:p>
-    <w:p>
-      <w:r>
-        <w:rPr>
-          <w:lang w:val="en-US"/>
-        </w:rPr>
-        <w:t xml:space="preserve">Next morning I left early. I called in at the local bakery and bought a mussel pie from the local bakery, oh my god it was good! The road out of Havelock runs beside </w:t>
-      </w:r>
-      <w:r>
-        <w:t xml:space="preserve">Pelorus </w:t>
-      </w:r>
-      <w:r>
-        <w:t xml:space="preserve">sound. The sun was just coming up and the </w:t>
-      </w:r>
-      <w:r>
-        <w:t xml:space="preserve">day was clear, the water </w:t>
-      </w:r>
-      <w:r>
-        <w:t xml:space="preserve">looked stunning in the morning sun. </w:t>
-      </w:r>
-      <w:r>
-        <w:rPr>
-          <w:lang w:val="en-US"/>
-        </w:rPr>
-        <w:t xml:space="preserve">From there I started the Richmond Ranges section. A rugged mountain range that took me 8 days to transverse. </w:t>
-      </w:r>
-    </w:p>
-    <w:p>
-      <w:r>
-        <w:rPr>
-          <w:lang w:val="en-US"/>
-        </w:rPr>
-        <w:t xml:space="preserve">I ran into the girls a couple of times and overnighted together in the [name] hut. The Isabella look alike was always friendly, talkative and fun, the other subdued. I exited the Richmond’s </w:t>
-      </w:r>
-      <w:r>
-        <w:rPr>
-          <w:lang w:val="en-US"/>
-        </w:rPr>
-        <w:t>and had a short walk to</w:t>
+      <w:r>
+        <w:rPr>
+          <w:lang w:val="en-US"/>
+        </w:rPr>
+        <w:t>stopped</w:t>
+      </w:r>
+      <w:r>
+        <w:rPr>
+          <w:lang w:val="en-US"/>
+        </w:rPr>
+        <w:t xml:space="preserve"> at the next hut to have lunch and </w:t>
+      </w:r>
+      <w:r>
+        <w:rPr>
+          <w:lang w:val="en-US"/>
+        </w:rPr>
+        <w:t xml:space="preserve">a few minutes later </w:t>
+      </w:r>
+      <w:r>
+        <w:rPr>
+          <w:lang w:val="en-US"/>
+        </w:rPr>
+        <w:t xml:space="preserve">the 2 girls joined me. The friend’s presence was lighter and we sat and chatted. </w:t>
+      </w:r>
+      <w:r>
+        <w:rPr>
+          <w:lang w:val="en-US"/>
+        </w:rPr>
+        <w:t>I</w:t>
+      </w:r>
+      <w:r>
+        <w:rPr>
+          <w:lang w:val="en-US"/>
+        </w:rPr>
+        <w:t xml:space="preserve"> cross</w:t>
+      </w:r>
+      <w:r>
+        <w:rPr>
+          <w:lang w:val="en-US"/>
+        </w:rPr>
+        <w:t>ed</w:t>
       </w:r>
       <w:r>
         <w:rPr>
@@ -2283,24 +2897,10 @@
         <w:t xml:space="preserve"> </w:t>
       </w:r>
       <w:r>
-        <w:t>St Arnaud</w:t>
-      </w:r>
-      <w:r>
-        <w:t>. Here I picked up my food supplies that I had previously sent down from Wellington. The TA has several forward drop points, strategically located so that food and supplies can be picked up on route.</w:t>
-      </w:r>
-    </w:p>
-    <w:p>
-      <w:pPr>
-        <w:rPr>
-          <w:lang w:val="en-US"/>
-        </w:rPr>
-      </w:pPr>
-      <w:r>
-        <w:rPr>
-          <w:lang w:val="en-US"/>
-        </w:rPr>
-        <w:lastRenderedPageBreak/>
-        <w:t>My arrival at</w:t>
+        <w:rPr>
+          <w:lang w:val="en-US"/>
+        </w:rPr>
+        <w:t>their</w:t>
       </w:r>
       <w:r>
         <w:rPr>
@@ -2309,264 +2909,108 @@
         <w:t xml:space="preserve"> </w:t>
       </w:r>
       <w:r>
-        <w:t>St Arnaud</w:t>
-      </w:r>
-      <w:r>
+        <w:rPr>
+          <w:lang w:val="en-US"/>
+        </w:rPr>
+        <w:t>paths a couple more times. I discovered later that the friend dropped out when I saw Isabella alone</w:t>
+      </w:r>
+      <w:r>
+        <w:rPr>
+          <w:lang w:val="en-US"/>
+        </w:rPr>
         <w:t xml:space="preserve"> </w:t>
       </w:r>
       <w:r>
-        <w:t xml:space="preserve">coincided with holes my </w:t>
-      </w:r>
-      <w:r>
-        <w:t xml:space="preserve">Merrell </w:t>
-      </w:r>
-      <w:r>
-        <w:t xml:space="preserve">boots. </w:t>
-      </w:r>
-      <w:r>
-        <w:t>I really liked them and t</w:t>
-      </w:r>
-      <w:r>
-        <w:t>hey had done well, a good [number] kms</w:t>
-      </w:r>
-      <w:r>
-        <w:t xml:space="preserve"> of sand, water</w:t>
-      </w:r>
-      <w:r>
-        <w:t>, rocks</w:t>
-      </w:r>
-      <w:r>
-        <w:t xml:space="preserve"> and hills</w:t>
-      </w:r>
-      <w:r>
-        <w:t xml:space="preserve">. </w:t>
-      </w:r>
-      <w:r>
-        <w:t>However t</w:t>
-      </w:r>
-      <w:r>
-        <w:t xml:space="preserve">heir </w:t>
-      </w:r>
-      <w:r>
-        <w:t>life</w:t>
-      </w:r>
-      <w:r>
-        <w:t xml:space="preserve"> was at an end, and the next section was another rugged mountain range. </w:t>
-      </w:r>
-      <w:r>
-        <w:t xml:space="preserve">I thought of duck tapping them but eventually decided to </w:t>
-      </w:r>
-      <w:r>
-        <w:t xml:space="preserve">cut out of the walk and hitch hike to </w:t>
-      </w:r>
-      <w:r>
-        <w:rPr>
-          <w:lang w:val="en-US"/>
-        </w:rPr>
-        <w:t>Blenheim</w:t>
-      </w:r>
-      <w:r>
-        <w:t xml:space="preserve">. </w:t>
-      </w:r>
-      <w:r>
-        <w:t>It took all afternoon to travel 100 kms and I arrived at 4:45</w:t>
-      </w:r>
-      <w:r>
-        <w:t>,</w:t>
-      </w:r>
-      <w:r>
-        <w:t xml:space="preserve"> </w:t>
-      </w:r>
-      <w:r>
-        <w:t>j</w:t>
-      </w:r>
-      <w:r>
-        <w:t>ust in time to find a shop that stocked hiking boots. Unfortunately</w:t>
-      </w:r>
-      <w:r>
-        <w:t>,</w:t>
-      </w:r>
-      <w:r>
-        <w:t xml:space="preserve"> they didn’t have </w:t>
-      </w:r>
-      <w:r>
-        <w:t>Merr</w:t>
-      </w:r>
-      <w:r>
-        <w:t>e</w:t>
-      </w:r>
-      <w:r>
-        <w:t>lls</w:t>
-      </w:r>
-      <w:r>
-        <w:t xml:space="preserve">. </w:t>
-      </w:r>
-      <w:r>
-        <w:t xml:space="preserve">I bought a pair of </w:t>
-      </w:r>
-      <w:r>
-        <w:t>Oboz</w:t>
-      </w:r>
-      <w:r>
-        <w:t xml:space="preserve"> and called Cynthia to see if I could stay the night. Cynthia was another old university friend and wife of John who I had walked the </w:t>
-      </w:r>
-      <w:r>
-        <w:rPr>
-          <w:lang w:val="en-US"/>
-        </w:rPr>
-        <w:t>Queen Charlotte with.</w:t>
-      </w:r>
-      <w:r>
-        <w:rPr>
-          <w:lang w:val="en-US"/>
-        </w:rPr>
-        <w:t xml:space="preserve"> </w:t>
-      </w:r>
-    </w:p>
-    <w:p>
-      <w:r>
-        <w:rPr>
-          <w:lang w:val="en-US"/>
-        </w:rPr>
-        <w:t xml:space="preserve">As a student I flatted with </w:t>
-      </w:r>
-      <w:r>
-        <w:t xml:space="preserve">Cynthia for 2 years in Palmerston North along with Tim and Shelley. We were a tight group of friends who </w:t>
-      </w:r>
-      <w:r>
-        <w:t xml:space="preserve">went </w:t>
-      </w:r>
-      <w:r>
-        <w:t xml:space="preserve">our own ways after university. </w:t>
-      </w:r>
-      <w:r>
-        <w:t>I had caught up with Cynthia infrequently through the years, so i</w:t>
-      </w:r>
-      <w:r>
-        <w:t xml:space="preserve">t was great to catch up with </w:t>
-      </w:r>
-      <w:r>
-        <w:t>them</w:t>
-      </w:r>
-      <w:r>
-        <w:t xml:space="preserve"> </w:t>
-      </w:r>
-      <w:r>
-        <w:t xml:space="preserve">again </w:t>
-      </w:r>
-      <w:r>
-        <w:t xml:space="preserve">and chew the fat. </w:t>
-      </w:r>
-    </w:p>
-    <w:p>
-      <w:r>
-        <w:t xml:space="preserve">The next morning John said he would drop me off on the outskirts of Blenheim so that I could hitch back to </w:t>
-      </w:r>
-      <w:r>
-        <w:t>St Arnaud</w:t>
-      </w:r>
-      <w:r>
-        <w:t>. To my surprise and g</w:t>
-      </w:r>
-      <w:r>
-        <w:t xml:space="preserve">ratitude, </w:t>
-      </w:r>
-      <w:r>
-        <w:t xml:space="preserve">he took me all the way, dropping me at the point I had cut out. I walked to the trail head on the shores of lake </w:t>
-      </w:r>
-      <w:r>
-        <w:t>Rotoiti</w:t>
-      </w:r>
-      <w:r>
-        <w:t xml:space="preserve"> and stood admiring the </w:t>
-      </w:r>
-      <w:r>
-        <w:t xml:space="preserve">fantastic </w:t>
-      </w:r>
-      <w:r>
-        <w:t>view.</w:t>
-      </w:r>
-      <w:r>
-        <w:t xml:space="preserve"> It is a </w:t>
-      </w:r>
-      <w:r>
-        <w:t>glacial lake</w:t>
-      </w:r>
-      <w:r>
-        <w:t xml:space="preserve"> beautifully bordered by mountains.</w:t>
-      </w:r>
-    </w:p>
-    <w:p>
-      <w:r>
-        <w:t xml:space="preserve">To my surprise the two girls </w:t>
-      </w:r>
-      <w:r>
-        <w:t xml:space="preserve">pulled up </w:t>
-      </w:r>
-      <w:r>
-        <w:t xml:space="preserve">in a van. </w:t>
-      </w:r>
-      <w:r>
-        <w:rPr>
-          <w:lang w:val="en-US"/>
-        </w:rPr>
-        <w:t xml:space="preserve">Isabella’s look a like’s mum had driven them and was joining them for a short way into the track. We </w:t>
+        <w:rPr>
+          <w:lang w:val="en-US"/>
+        </w:rPr>
+        <w:t>in Kiwi Hut</w:t>
+      </w:r>
+      <w:r>
+        <w:rPr>
+          <w:lang w:val="en-US"/>
+        </w:rPr>
+        <w:t xml:space="preserve"> where she and a walker from Belgium overnighted. We were sitting together eating our meals when there </w:t>
       </w:r>
       <w:proofErr w:type="gramStart"/>
       <w:r>
         <w:rPr>
           <w:lang w:val="en-US"/>
         </w:rPr>
-        <w:t>hat</w:t>
+        <w:t>are</w:t>
       </w:r>
       <w:proofErr w:type="gramEnd"/>
       <w:r>
         <w:rPr>
           <w:lang w:val="en-US"/>
         </w:rPr>
-        <w:t xml:space="preserve"> a quick </w:t>
+        <w:t xml:space="preserve"> a loud bang in the front bedroom….</w:t>
+      </w:r>
+    </w:p>
+    <w:p>
+      <w:pPr>
+        <w:rPr>
+          <w:lang w:val="en-US"/>
+        </w:rPr>
+      </w:pPr>
+      <w:r>
+        <w:rPr>
+          <w:lang w:val="en-US"/>
+        </w:rPr>
+        <w:t xml:space="preserve">We caught up after the walk in Wellington. She worked at Kathmandu and gave me a discount voucher for myself and Jenny, which we gratefully used to purchase new raincoats. </w:t>
+      </w:r>
+    </w:p>
+    <w:p>
+      <w:pPr>
+        <w:rPr>
+          <w:lang w:val="en-US"/>
+        </w:rPr>
+      </w:pPr>
+      <w:r>
+        <w:rPr>
+          <w:lang w:val="en-US"/>
+        </w:rPr>
+        <w:t xml:space="preserve">Isabella told me the friend returned to the farm midway </w:t>
+      </w:r>
+      <w:r>
+        <w:rPr>
+          <w:lang w:val="en-US"/>
+        </w:rPr>
+        <w:t>through</w:t>
+      </w:r>
+      <w:r>
+        <w:rPr>
+          <w:lang w:val="en-US"/>
+        </w:rPr>
+        <w:t xml:space="preserve"> the walk</w:t>
+      </w:r>
+      <w:r>
+        <w:rPr>
+          <w:lang w:val="en-US"/>
+        </w:rPr>
+        <w:t xml:space="preserve">. The TA had given her the space and solitude to release </w:t>
       </w:r>
       <w:proofErr w:type="gramStart"/>
       <w:r>
         <w:rPr>
           <w:lang w:val="en-US"/>
         </w:rPr>
-        <w:t>chat</w:t>
+        <w:t>grief</w:t>
       </w:r>
       <w:proofErr w:type="gramEnd"/>
       <w:r>
         <w:rPr>
           <w:lang w:val="en-US"/>
         </w:rPr>
-        <w:t xml:space="preserve"> and they set off ahead of me. </w:t>
-      </w:r>
-    </w:p>
-    <w:p>
-      <w:pPr>
-        <w:rPr>
-          <w:lang w:val="en-US"/>
-        </w:rPr>
-      </w:pPr>
-    </w:p>
-    <w:p>
-      <w:pPr>
-        <w:rPr>
-          <w:lang w:val="en-US"/>
-        </w:rPr>
-      </w:pPr>
-    </w:p>
-    <w:p>
-      <w:pPr>
-        <w:rPr>
-          <w:lang w:val="en-US"/>
-        </w:rPr>
-      </w:pPr>
-      <w:r>
-        <w:rPr>
-          <w:lang w:val="en-US"/>
-        </w:rPr>
-        <w:t>Sobbing. Her dad had not long died. She never finished.</w:t>
-      </w:r>
+        <w:t xml:space="preserve"> and she no longer needed to walk.</w:t>
+      </w:r>
+    </w:p>
+    <w:p>
+      <w:pPr>
+        <w:rPr>
+          <w:lang w:val="en-US"/>
+        </w:rPr>
+      </w:pPr>
     </w:p>
     <w:p>
       <w:pPr>

</xml_diff>